<commit_message>
Report gains the limitation the ensemble just measured
The submission-night finding goes in before the submission: one paragraph
ahead of the conclusions stating that the report's sigmas are statistical
reproducibility, that six independent realizations of the winner's
composition spread 8.1% in loading and 0.93 kJ/mol in Q_st across site
placements, which comparisons survive compounding that variance and
which dissolve, and that the winner's 2.10 sigma margin sits somewhere
between 0.7 and 2.1 sigma until the humid placement variance is
measured. Estimator moves to 7.1 pages. The pre-amendment version
remains at afb6edb if the user prefers to submit without it.

Co-Authored-By: Claude Fable 5 <noreply@anthropic.com>
Claude-Session: https://claude.ai/code/session_016GdUg8U1oPQTdSB5AMZPHz
</commit_message>
<xml_diff>
--- a/04_Analysis/MTV_ZIF69_보고서_최종.docx
+++ b/04_Analysis/MTV_ZIF69_보고서_최종.docx
@@ -6295,6 +6295,30 @@
           <w:i w:val="0"/>
           <w:sz w:val="20"/>
         </w:rPr>
+        <w:t xml:space="preserve">오차의 범위 — 자리 배치 분산. </w:t>
+      </w:r>
+      <w:r>
+        <w:rPr>
+          <w:rFonts w:ascii="Times New Roman" w:hAnsi="Times New Roman" w:eastAsia="맑은 고딕"/>
+          <w:b w:val="0"/>
+          <w:i w:val="0"/>
+          <w:sz w:val="20"/>
+        </w:rPr>
+        <w:t>본 보고서의 ±σ는 같은 구조를 같은 조건으로 반복 계산할 때의 통계 재현성이다. 부분 치환 구조에는 이와 별개의 오차 축이 있다 — 같은 치환율이라도 24개 자리 중 어느 14개에 넣었는가가 이완 후 기공 기하를 바꾼다. 승자 조성과 동일한 조성비로 치환 자리만 달리한 6개 독립 실현의 건조 흡착을 측정한 결과, 실현 간 표준편차는 로딩 0.096 mol/kg(상대 8.1%, 통계 오차의 7.2배), Q_st 0.93 kJ/mol(3.4배)였고, 로딩은 실현별 공동 크기와 반상관했다(r≈−0.7) — 잡음이 아니라 기하 다형성이다. 이 분산을 합성하면 치환의 전 구간 효과(로딩 6.8σ, Q_st 8.1σ)와 사다리 초반 계단은 그대로 유의하지만, 인접 격자점 간 미세 간격 다수는 유의성을 잃는다. 6절의 승자 간격 2.10σ는 통계 오차 기준이며, 습윤 작업 용량의 배치 분산은 아직 측정되지 않았다 — 건조와 같은 비율을 가정하면 0.7σ, 없다고 가정하면 2.1σ 사이에 있다. 따라서 58.3%는 “측정된 제약 안에서 생존자 중 통계적 1위”로 읽어야 하며, 조성 간 미세 서열의 확정에는 실현 앙상블 기반의 오차가 필요하다는 것이 본 연구의 마지막 방법론적 결론이다.</w:t>
+      </w:r>
+    </w:p>
+    <w:p>
+      <w:pPr>
+        <w:spacing w:line="240" w:lineRule="auto" w:after="100"/>
+        <w:jc w:val="both"/>
+      </w:pPr>
+      <w:r>
+        <w:rPr>
+          <w:rFonts w:ascii="Times New Roman" w:hAnsi="Times New Roman" w:eastAsia="맑은 고딕"/>
+          <w:b/>
+          <w:i w:val="0"/>
+          <w:sz w:val="20"/>
+        </w:rPr>
         <w:t xml:space="preserve">결론. </w:t>
       </w:r>
       <w:r>

</xml_diff>